<commit_message>
Lisää GitHub Desktopin kuvaohje projektien aloitukseen
</commit_message>
<xml_diff>
--- a/noppakauppa/downloads/noppakauppa-tyopaketti.docx
+++ b/noppakauppa/downloads/noppakauppa-tyopaketti.docx
@@ -4,7 +4,7 @@
   <w:body>
     <w:p>
       <w:pPr>
-        <w:spacing w:before="2400" w:after="200"/>
+        <w:spacing w:after="200" w:before="2400"/>
         <w:jc w:val="center"/>
       </w:pPr>
       <w:r>
@@ -110,7 +110,7 @@
     <w:p>
       <w:pPr>
         <w:pStyle w:val="Heading1"/>
-        <w:spacing w:before="320" w:after="160"/>
+        <w:spacing w:after="160" w:before="320"/>
       </w:pPr>
       <w:r>
         <w:rPr>
@@ -188,7 +188,7 @@
     <w:p>
       <w:pPr>
         <w:pStyle w:val="Heading2"/>
-        <w:spacing w:before="260" w:after="120"/>
+        <w:spacing w:after="120" w:before="260"/>
       </w:pPr>
       <w:r>
         <w:rPr>
@@ -357,7 +357,7 @@
     <w:p>
       <w:pPr>
         <w:pStyle w:val="Heading1"/>
-        <w:spacing w:before="320" w:after="160"/>
+        <w:spacing w:after="160" w:before="320"/>
       </w:pPr>
       <w:r>
         <w:rPr>
@@ -2247,7 +2247,7 @@
     <w:p>
       <w:pPr>
         <w:pStyle w:val="Heading1"/>
-        <w:spacing w:before="320" w:after="160"/>
+        <w:spacing w:after="160" w:before="320"/>
       </w:pPr>
       <w:r>
         <w:rPr>
@@ -2261,7 +2261,7 @@
     <w:p>
       <w:pPr>
         <w:pStyle w:val="Heading2"/>
-        <w:spacing w:before="260" w:after="120"/>
+        <w:spacing w:after="120" w:before="260"/>
       </w:pPr>
       <w:r>
         <w:rPr>
@@ -2297,6 +2297,28 @@
         </w:rPr>
         <w:t xml:space="preserve">Viikon tavoite: Kaupan runko käynnistyy omalla koneellasi README:n komennoilla, ja kysymyslistan vastaukset on kirjattu.</w:t>
       </w:r>
+    </w:p>
+    <w:p>
+      <w:pPr>
+        <w:spacing w:after="80"/>
+      </w:pPr>
+      <w:r>
+        <w:rPr>
+          <w:sz w:val="19"/>
+          <w:szCs w:val="19"/>
+        </w:rPr>
+        <w:t xml:space="preserve">Kuvaohje tai materiaali: </w:t>
+      </w:r>
+      <w:hyperlink w:history="1" r:id="rIdbln_nm2x_hy006mpv9kpu">
+        <w:r>
+          <w:rPr>
+            <w:rStyle w:val="Hyperlink"/>
+            <w:sz w:val="19"/>
+            <w:szCs w:val="19"/>
+          </w:rPr>
+          <w:t xml:space="preserve">GitHub Desktop: kuvaohje ilman Git-komentoja</w:t>
+        </w:r>
+      </w:hyperlink>
     </w:p>
     <w:p>
       <w:pPr>
@@ -2510,7 +2532,7 @@
           <w:sz w:val="19"/>
           <w:szCs w:val="19"/>
         </w:rPr>
-        <w:t xml:space="preserve">☐  1. Luo kansiot. Luo projektikansio ja sen alle kansiot frontend/, backend/ ja project-docs/.</w:t>
+        <w:t xml:space="preserve">☐  1. Luo kansiot. Luo projektikansio noppakauppa/ ja sen alle frontend/, backend/ ja project-docs/. Git ei tallenna tyhjiä kansioita: lisää frontend- ja backend-kansioon aluksi README tai .gitkeep, jotta kansiorakenne näkyy ensimmäisessä commitissa.</w:t>
       </w:r>
     </w:p>
     <w:p>
@@ -2562,7 +2584,7 @@
           <w:sz w:val="19"/>
           <w:szCs w:val="19"/>
         </w:rPr>
-        <w:t xml:space="preserve">☐  5. Tee ensimmäinen commit. Aja git init ja tee ensimmäinen commit. Luo GitHubiin repository sovitulla julkisuudella ja vie commit sinne komennolla git push.</w:t>
+        <w:t xml:space="preserve">☐  5. Tee ensimmäinen commit. Seuraa GitHub Desktop -kuvaohjetta: asennus, kirjautuminen, nykyisen kansion lisääminen (B), Changes-tarkistus ja Commit. Lähetä sovitulla julkisuudella: Publish repository tai jo julkaistulle repolle Push origin. Tarkista tiedostot View on GitHub -toiminnolla.</w:t>
       </w:r>
     </w:p>
     <w:p>
@@ -2656,7 +2678,7 @@
           <w:sz w:val="19"/>
           <w:szCs w:val="19"/>
         </w:rPr>
-        <w:t xml:space="preserve">☐  4. Kirjaa komennot READMEen. Lisää README:hen molempien palvelinten käynnistyskomennot ja tee commit.</w:t>
+        <w:t xml:space="preserve">☐  4. Kirjaa komennot READMEen. Lisää README:hen molempien palvelinten käynnistyskomennot. Tee Desktopissa Commit ja Push origin myös sovellusrungosta. Tarkista muutokset GitHubista.</w:t>
       </w:r>
     </w:p>
     <w:p>
@@ -2731,7 +2753,7 @@
     <w:p>
       <w:pPr>
         <w:pStyle w:val="Heading2"/>
-        <w:spacing w:before="260" w:after="120"/>
+        <w:spacing w:after="120" w:before="260"/>
       </w:pPr>
       <w:r>
         <w:rPr>
@@ -2767,6 +2789,28 @@
         </w:rPr>
         <w:t xml:space="preserve">Viikon tavoite: Tarinat, tietomalli ja rautalangat on kirjattu, ja kaupan pakollinen ydin on GitHubissa vähintään kahdeksana issuena.</w:t>
       </w:r>
+    </w:p>
+    <w:p>
+      <w:pPr>
+        <w:spacing w:after="80"/>
+      </w:pPr>
+      <w:r>
+        <w:rPr>
+          <w:sz w:val="19"/>
+          <w:szCs w:val="19"/>
+        </w:rPr>
+        <w:t xml:space="preserve">Kuvaohje tai materiaali: </w:t>
+      </w:r>
+      <w:hyperlink w:history="1" r:id="rIdq41ulogi-lzvbk1hzfmux">
+        <w:r>
+          <w:rPr>
+            <w:rStyle w:val="Hyperlink"/>
+            <w:sz w:val="19"/>
+            <w:szCs w:val="19"/>
+          </w:rPr>
+          <w:t xml:space="preserve">Avaa suunnitelmalomake</w:t>
+        </w:r>
+      </w:hyperlink>
     </w:p>
     <w:p>
       <w:pPr>
@@ -3201,7 +3245,7 @@
     <w:p>
       <w:pPr>
         <w:pStyle w:val="Heading1"/>
-        <w:spacing w:before="320" w:after="160"/>
+        <w:spacing w:after="160" w:before="320"/>
       </w:pPr>
       <w:r>
         <w:rPr>
@@ -3215,7 +3259,7 @@
     <w:p>
       <w:pPr>
         <w:pStyle w:val="Heading2"/>
-        <w:spacing w:before="260" w:after="120"/>
+        <w:spacing w:after="120" w:before="260"/>
       </w:pPr>
       <w:r>
         <w:rPr>
@@ -3659,7 +3703,7 @@
     <w:p>
       <w:pPr>
         <w:pStyle w:val="Heading2"/>
-        <w:spacing w:before="260" w:after="120"/>
+        <w:spacing w:after="120" w:before="260"/>
       </w:pPr>
       <w:r>
         <w:rPr>
@@ -4103,7 +4147,7 @@
     <w:p>
       <w:pPr>
         <w:pStyle w:val="Heading2"/>
-        <w:spacing w:before="260" w:after="120"/>
+        <w:spacing w:after="120" w:before="260"/>
       </w:pPr>
       <w:r>
         <w:rPr>
@@ -4534,7 +4578,7 @@
     <w:p>
       <w:pPr>
         <w:pStyle w:val="Heading1"/>
-        <w:spacing w:before="320" w:after="160"/>
+        <w:spacing w:after="160" w:before="320"/>
       </w:pPr>
       <w:r>
         <w:rPr>
@@ -4548,7 +4592,7 @@
     <w:p>
       <w:pPr>
         <w:pStyle w:val="Heading2"/>
-        <w:spacing w:before="260" w:after="120"/>
+        <w:spacing w:after="120" w:before="260"/>
       </w:pPr>
       <w:r>
         <w:rPr>
@@ -4979,7 +5023,7 @@
     <w:p>
       <w:pPr>
         <w:pStyle w:val="Heading2"/>
-        <w:spacing w:before="260" w:after="120"/>
+        <w:spacing w:after="120" w:before="260"/>
       </w:pPr>
       <w:r>
         <w:rPr>
@@ -5449,7 +5493,7 @@
     <w:p>
       <w:pPr>
         <w:pStyle w:val="Heading2"/>
-        <w:spacing w:before="260" w:after="120"/>
+        <w:spacing w:after="120" w:before="260"/>
       </w:pPr>
       <w:r>
         <w:rPr>
@@ -5893,7 +5937,7 @@
     <w:p>
       <w:pPr>
         <w:pStyle w:val="Heading2"/>
-        <w:spacing w:before="260" w:after="120"/>
+        <w:spacing w:after="120" w:before="260"/>
       </w:pPr>
       <w:r>
         <w:rPr>
@@ -6350,7 +6394,7 @@
     <w:p>
       <w:pPr>
         <w:pStyle w:val="Heading2"/>
-        <w:spacing w:before="260" w:after="120"/>
+        <w:spacing w:after="120" w:before="260"/>
       </w:pPr>
       <w:r>
         <w:rPr>
@@ -6755,7 +6799,7 @@
     <w:p>
       <w:pPr>
         <w:pStyle w:val="Heading1"/>
-        <w:spacing w:before="320" w:after="160"/>
+        <w:spacing w:after="160" w:before="320"/>
       </w:pPr>
       <w:r>
         <w:rPr>
@@ -6769,7 +6813,7 @@
     <w:p>
       <w:pPr>
         <w:pStyle w:val="Heading2"/>
-        <w:spacing w:before="260" w:after="120"/>
+        <w:spacing w:after="120" w:before="260"/>
       </w:pPr>
       <w:r>
         <w:rPr>
@@ -7213,7 +7257,7 @@
     <w:p>
       <w:pPr>
         <w:pStyle w:val="Heading2"/>
-        <w:spacing w:before="260" w:after="120"/>
+        <w:spacing w:after="120" w:before="260"/>
       </w:pPr>
       <w:r>
         <w:rPr>
@@ -7644,7 +7688,7 @@
     <w:p>
       <w:pPr>
         <w:pStyle w:val="Heading2"/>
-        <w:spacing w:before="260" w:after="120"/>
+        <w:spacing w:after="120" w:before="260"/>
       </w:pPr>
       <w:r>
         <w:rPr>
@@ -8075,7 +8119,7 @@
     <w:p>
       <w:pPr>
         <w:pStyle w:val="Heading2"/>
-        <w:spacing w:before="260" w:after="120"/>
+        <w:spacing w:after="120" w:before="260"/>
       </w:pPr>
       <w:r>
         <w:rPr>
@@ -8506,7 +8550,7 @@
     <w:p>
       <w:pPr>
         <w:pStyle w:val="Heading2"/>
-        <w:spacing w:before="260" w:after="120"/>
+        <w:spacing w:after="120" w:before="260"/>
       </w:pPr>
       <w:r>
         <w:rPr>
@@ -8843,7 +8887,7 @@
     <w:p>
       <w:pPr>
         <w:pStyle w:val="Heading1"/>
-        <w:spacing w:before="320" w:after="160"/>
+        <w:spacing w:after="160" w:before="320"/>
       </w:pPr>
       <w:r>
         <w:rPr>
@@ -8857,7 +8901,7 @@
     <w:p>
       <w:pPr>
         <w:pStyle w:val="Heading2"/>
-        <w:spacing w:before="260" w:after="120"/>
+        <w:spacing w:after="120" w:before="260"/>
       </w:pPr>
       <w:r>
         <w:rPr>
@@ -9288,7 +9332,7 @@
     <w:p>
       <w:pPr>
         <w:pStyle w:val="Heading2"/>
-        <w:spacing w:before="260" w:after="120"/>
+        <w:spacing w:after="120" w:before="260"/>
       </w:pPr>
       <w:r>
         <w:rPr>
@@ -9706,7 +9750,7 @@
     <w:p>
       <w:pPr>
         <w:pStyle w:val="Heading2"/>
-        <w:spacing w:before="260" w:after="120"/>
+        <w:spacing w:after="120" w:before="260"/>
       </w:pPr>
       <w:r>
         <w:rPr>
@@ -10116,7 +10160,7 @@
     <w:p>
       <w:pPr>
         <w:pStyle w:val="Heading1"/>
-        <w:spacing w:before="320" w:after="160"/>
+        <w:spacing w:after="160" w:before="320"/>
       </w:pPr>
       <w:r>
         <w:rPr>
@@ -10205,7 +10249,7 @@
     <w:p>
       <w:pPr>
         <w:pStyle w:val="Heading1"/>
-        <w:spacing w:before="320" w:after="160"/>
+        <w:spacing w:after="160" w:before="320"/>
       </w:pPr>
       <w:r>
         <w:rPr>
@@ -11813,7 +11857,7 @@
     <w:p>
       <w:pPr>
         <w:pStyle w:val="Heading1"/>
-        <w:spacing w:before="320" w:after="160"/>
+        <w:spacing w:after="160" w:before="320"/>
       </w:pPr>
       <w:r>
         <w:rPr>
@@ -11840,7 +11884,7 @@
     <w:p>
       <w:pPr>
         <w:pStyle w:val="Heading2"/>
-        <w:spacing w:before="260" w:after="120"/>
+        <w:spacing w:after="120" w:before="260"/>
       </w:pPr>
       <w:r>
         <w:rPr>
@@ -11986,7 +12030,7 @@
     <w:p>
       <w:pPr>
         <w:pStyle w:val="Heading2"/>
-        <w:spacing w:before="260" w:after="120"/>
+        <w:spacing w:after="120" w:before="260"/>
       </w:pPr>
       <w:r>
         <w:rPr>
@@ -12168,7 +12212,7 @@
     <w:p>
       <w:pPr>
         <w:pStyle w:val="Heading2"/>
-        <w:spacing w:before="260" w:after="120"/>
+        <w:spacing w:after="120" w:before="260"/>
       </w:pPr>
       <w:r>
         <w:rPr>
@@ -12290,6 +12334,43 @@
 
 <file path=word/comments.xml><?xml version="1.0" encoding="utf-8"?>
 <w:comments xmlns:cx="http://schemas.microsoft.com/office/drawing/2014/chartex" xmlns:cx1="http://schemas.microsoft.com/office/drawing/2015/9/8/chartex" xmlns:cx2="http://schemas.microsoft.com/office/drawing/2015/10/21/chartex" xmlns:cx3="http://schemas.microsoft.com/office/drawing/2016/5/9/chartex" xmlns:cx4="http://schemas.microsoft.com/office/drawing/2016/5/10/chartex" xmlns:cx5="http://schemas.microsoft.com/office/drawing/2016/5/11/chartex" xmlns:cx6="http://schemas.microsoft.com/office/drawing/2016/5/12/chartex" xmlns:cx7="http://schemas.microsoft.com/office/drawing/2016/5/13/chartex" xmlns:cx8="http://schemas.microsoft.com/office/drawing/2016/5/14/chartex" xmlns:mc="http://schemas.openxmlformats.org/markup-compatibility/2006" xmlns:aink="http://schemas.microsoft.com/office/drawing/2016/ink" xmlns:am3d="http://schemas.microsoft.com/office/drawing/2017/model3d" xmlns:o="urn:schemas-microsoft-com:office:office" xmlns:r="http://schemas.openxmlformats.org/officeDocument/2006/relationships" xmlns:m="http://schemas.openxmlformats.org/officeDocument/2006/math" xmlns:v="urn:schemas-microsoft-com:vml" xmlns:wp14="http://schemas.microsoft.com/office/word/2010/wordprocessingDrawing" xmlns:wp="http://schemas.openxmlformats.org/drawingml/2006/wordprocessingDrawing" xmlns:w10="urn:schemas-microsoft-com:office:word" xmlns:w="http://schemas.openxmlformats.org/wordprocessingml/2006/main" xmlns:w14="http://schemas.microsoft.com/office/word/2010/wordml" xmlns:w15="http://schemas.microsoft.com/office/word/2012/wordml" xmlns:w16cex="http://schemas.microsoft.com/office/word/2018/wordml/cex" xmlns:w16cid="http://schemas.microsoft.com/office/word/2016/wordml/cid" xmlns:w16="http://schemas.microsoft.com/office/word/2018/wordml" xmlns:w16sdtdh="http://schemas.microsoft.com/office/word/2020/wordml/sdtdatahash" xmlns:w16se="http://schemas.microsoft.com/office/word/2015/wordml/symex" xmlns:wpg="http://schemas.microsoft.com/office/word/2010/wordprocessingGroup" xmlns:wpi="http://schemas.microsoft.com/office/word/2010/wordprocessingInk" xmlns:wne="http://schemas.microsoft.com/office/word/2006/wordml" xmlns:wps="http://schemas.microsoft.com/office/word/2010/wordprocessingShape"/>
+</file>
+
+<file path=word/endnotes.xml><?xml version="1.0" encoding="utf-8"?>
+<w:endnotes xmlns:wpc="http://schemas.microsoft.com/office/word/2010/wordprocessingCanvas" xmlns:mc="http://schemas.openxmlformats.org/markup-compatibility/2006" xmlns:o="urn:schemas-microsoft-com:office:office" xmlns:r="http://schemas.openxmlformats.org/officeDocument/2006/relationships" xmlns:m="http://schemas.openxmlformats.org/officeDocument/2006/math" xmlns:v="urn:schemas-microsoft-com:vml" xmlns:wp14="http://schemas.microsoft.com/office/word/2010/wordprocessingDrawing" xmlns:wp="http://schemas.openxmlformats.org/drawingml/2006/wordprocessingDrawing" xmlns:w10="urn:schemas-microsoft-com:office:word" xmlns:w="http://schemas.openxmlformats.org/wordprocessingml/2006/main" xmlns:w14="http://schemas.microsoft.com/office/word/2010/wordml" xmlns:w15="http://schemas.microsoft.com/office/word/2012/wordml" xmlns:wpg="http://schemas.microsoft.com/office/word/2010/wordprocessingGroup" xmlns:wpi="http://schemas.microsoft.com/office/word/2010/wordprocessingInk" xmlns:wne="http://schemas.microsoft.com/office/word/2006/wordml" xmlns:wps="http://schemas.microsoft.com/office/word/2010/wordprocessingShape" mc:Ignorable="w14 w15 wp14">
+  <w:endnote w:type="separator" w:id="-1">
+    <w:p>
+      <w:pPr>
+        <w:spacing w:after="0" w:line="240" w:lineRule="auto"/>
+      </w:pPr>
+      <w:r>
+        <w:rPr>
+          <w:rStyle w:val="EndnoteReference"/>
+        </w:rPr>
+        <w:endnoteRef/>
+      </w:r>
+      <w:r>
+        <w:separator/>
+      </w:r>
+    </w:p>
+  </w:endnote>
+  <w:endnote w:type="continuationSeparator" w:id="0">
+    <w:p>
+      <w:pPr>
+        <w:spacing w:after="0" w:line="240" w:lineRule="auto"/>
+      </w:pPr>
+      <w:r>
+        <w:rPr>
+          <w:rStyle w:val="EndnoteReference"/>
+        </w:rPr>
+        <w:endnoteRef/>
+      </w:r>
+      <w:r>
+        <w:continuationSeparator/>
+      </w:r>
+    </w:p>
+  </w:endnote>
+</w:endnotes>
 </file>
 
 <file path=word/footnotes.xml><?xml version="1.0" encoding="utf-8"?>
@@ -12429,9 +12510,9 @@
   <w:docDefaults>
     <w:rPrDefault>
       <w:rPr>
+        <w:rFonts w:ascii="Calibri" w:cs="Calibri" w:eastAsia="Calibri" w:hAnsi="Calibri"/>
         <w:sz w:val="21"/>
         <w:szCs w:val="21"/>
-        <w:rFonts w:ascii="Calibri" w:cs="Calibri" w:eastAsia="Calibri" w:hAnsi="Calibri"/>
       </w:rPr>
     </w:rPrDefault>
     <w:pPrDefault/>
@@ -12529,8 +12610,8 @@
     <w:uiPriority w:val="99"/>
     <w:unhideWhenUsed/>
     <w:rPr>
+      <w:color w:val="0563C1"/>
       <w:u w:val="single"/>
-      <w:color w:val="0563C1"/>
     </w:rPr>
   </w:style>
   <w:style w:type="character" w:styleId="FootnoteReference">
@@ -12570,5 +12651,42 @@
       <w:szCs w:val="20"/>
     </w:rPr>
   </w:style>
+  <w:style w:type="character" w:styleId="EndnoteReference">
+    <w:name w:val="endnote reference"/>
+    <w:basedOn w:val="DefaultParagraphFont"/>
+    <w:uiPriority w:val="99"/>
+    <w:semiHidden/>
+    <w:unhideWhenUsed/>
+    <w:rPr>
+      <w:vertAlign w:val="superscript"/>
+    </w:rPr>
+  </w:style>
+  <w:style w:type="paragraph" w:styleId="EndnoteText">
+    <w:name w:val="endnote text"/>
+    <w:basedOn w:val="Normal"/>
+    <w:link w:val="EndnoteTextChar"/>
+    <w:uiPriority w:val="99"/>
+    <w:semiHidden/>
+    <w:unhideWhenUsed/>
+    <w:pPr>
+      <w:spacing w:after="0" w:line="240" w:lineRule="auto"/>
+    </w:pPr>
+    <w:rPr>
+      <w:sz w:val="20"/>
+      <w:szCs w:val="20"/>
+    </w:rPr>
+  </w:style>
+  <w:style w:type="character" w:styleId="EndnoteTextChar">
+    <w:name w:val="Endnote Text Char"/>
+    <w:basedOn w:val="DefaultParagraphFont"/>
+    <w:link w:val="EndnoteText"/>
+    <w:uiPriority w:val="99"/>
+    <w:semiHidden/>
+    <w:unhideWhenUsed/>
+    <w:rPr>
+      <w:sz w:val="20"/>
+      <w:szCs w:val="20"/>
+    </w:rPr>
+  </w:style>
 </w:styles>
 </file>
</xml_diff>

<commit_message>
Moottori v2.7.4: kaikki yhdeksän projektia samalla moottorilla
styles.css: v2.7:n säännöt rajattu :where(html:not([data-teema])) ja
saavutettavan teeman säännöt :where(html[data-teema]) -etuliitteillä, jotka
eivät nosta spesifisyyttä. Vektoripajan teemalohko on nyt jaetussa CSS:ssä.
Todennettu lasketuilla tyyleillä kaikissa näkymissä 1280 ja 390 px:
Vektoripaja 0 tyylieroa 9 120 elementissä, Valokaari 0 eroa 6 514:ssä.
tarkista.js hyväksyy staattisen vaihekuvauksen (section.project-roadmap).
tee_vaihekuva.js ei kirjoita mitään ilman vaihekuva-kenttää (Vektoripajan
suuritekstinen vaihekuva säilyy). tee_lataukset.js: suurikirjaimisessa teema-
ja tulosteversiossa taitto jatkuu (ei aukkoja), tavoitekuva vain näyttöversioon,
viikkomerkintää ei toisteta vaiheen kuvauksessa. Assettiversio v2.7.4.

Co-Authored-By: Claude Opus 5.5 <noreply@anthropic.com>
</commit_message>
<xml_diff>
--- a/noppakauppa/downloads/noppakauppa-tyopaketti.docx
+++ b/noppakauppa/downloads/noppakauppa-tyopaketti.docx
@@ -2309,7 +2309,7 @@
         </w:rPr>
         <w:t xml:space="preserve">Kuvaohje tai materiaali: </w:t>
       </w:r>
-      <w:hyperlink w:history="1" r:id="rId2_oruoashqbjlcgsvg0gy">
+      <w:hyperlink w:history="1" r:id="rIdcshuzvehvaduwicvoot3m">
         <w:r>
           <w:rPr>
             <w:sz w:val="19"/>
@@ -2801,7 +2801,7 @@
         </w:rPr>
         <w:t xml:space="preserve">Kuvaohje tai materiaali: </w:t>
       </w:r>
-      <w:hyperlink w:history="1" r:id="rIdnpymx8mzp4jjvmygcb8co">
+      <w:hyperlink w:history="1" r:id="rIdktlwggwoyjgjd90cwzjwx">
         <w:r>
           <w:rPr>
             <w:sz w:val="19"/>

</xml_diff>